<commit_message>
Auditor-silence paper (Persian) with full file set; fix literal italic markers and DOI links in Persian docs and questionnaires
Co-Authored-By: Claude Sonnet 5.5 <noreply@anthropic.com>
Claude-Session: https://claude.ai/code/session_01B6hBNJS5eMNFXmCvfzEnc8
</commit_message>
<xml_diff>
--- a/fomo_two_papers/deliverables/paper3/Paper3_Questionnaire_FA.docx
+++ b/fomo_two_papers/deliverables/paper3/Paper3_Questionnaire_FA.docx
@@ -1755,7 +1755,7 @@
           <w:szCs w:val="24"/>
           <w:lang w:val="en-US" w:bidi="fa-IR"/>
         </w:rPr>
-        <w:t xml:space="preserve">Venkatesh, V., Thong, J. Y. L., &amp; Xu, X. (2012). Consumer acceptance and use of information technology: Extending the unified theory of acceptance and use of technology. MIS Quarterly, 36(1), 157–178. https:doi.org/10.2307/41410412</w:t>
+        <w:t xml:space="preserve">Venkatesh, V., Thong, J. Y. L., &amp; Xu, X. (2012). Consumer acceptance and use of information technology: Extending the unified theory of acceptance and use of technology. MIS Quarterly, 36(1), 157–178. https://doi.org/10.2307/41410412</w:t>
       </w:r>
     </w:p>
     <w:p>
@@ -2356,7 +2356,7 @@
           <w:szCs w:val="24"/>
           <w:lang w:val="en-US" w:bidi="fa-IR"/>
         </w:rPr>
-        <w:t xml:space="preserve">Lusardi, A., &amp; Mitchell, O. S. (2014). The economic importance of financial literacy: Theory and evidence. Journal of Economic Literature, 52(1), 5–44. https:doi.org/10.1257/jel.52.1.5</w:t>
+        <w:t xml:space="preserve">Lusardi, A., &amp; Mitchell, O. S. (2014). The economic importance of financial literacy: Theory and evidence. Journal of Economic Literature, 52(1), 5–44. https://doi.org/10.1257/jel.52.1.5</w:t>
       </w:r>
     </w:p>
     <w:p>
@@ -2371,7 +2371,7 @@
           <w:szCs w:val="24"/>
           <w:lang w:val="en-US" w:bidi="fa-IR"/>
         </w:rPr>
-        <w:t xml:space="preserve">Van Rooij, M., Lusardi, A., &amp; Alessie, R. (2011). Financial literacy and stock market participation. Journal of Financial Economics, 101(2), 449–472. https:doi.org/10.1016/j.jfineco.2011.03.006</w:t>
+        <w:t xml:space="preserve">Van Rooij, M., Lusardi, A., &amp; Alessie, R. (2011). Financial literacy and stock market participation. Journal of Financial Economics, 101(2), 449–472. https://doi.org/10.1016/j.jfineco.2011.03.006</w:t>
       </w:r>
     </w:p>
     <w:p>
@@ -2678,7 +2678,7 @@
           <w:szCs w:val="24"/>
           <w:lang w:val="en-US" w:bidi="fa-IR"/>
         </w:rPr>
-        <w:t xml:space="preserve">Kruger, J., &amp; Dunning, D. (1999). Unskilled and unaware of it: How difficulties in recognizing one's own incompetence lead to inflated self-assessments. Journal of Personality and Social Psychology, 77(6), 1121–1134. https:doi.org/10.1037/0022-3514.77.6.1121</w:t>
+        <w:t xml:space="preserve">Kruger, J., &amp; Dunning, D. (1999). Unskilled and unaware of it: How difficulties in recognizing one's own incompetence lead to inflated self-assessments. Journal of Personality and Social Psychology, 77(6), 1121–1134. https://doi.org/10.1037/0022-3514.77.6.1121</w:t>
       </w:r>
     </w:p>
     <w:p>
@@ -2693,7 +2693,7 @@
           <w:szCs w:val="24"/>
           <w:lang w:val="en-US" w:bidi="fa-IR"/>
         </w:rPr>
-        <w:t xml:space="preserve">Moore, D. A., &amp; Healy, P. J. (2008). The trouble with overconfidence. Psychological Review, 115(2), 502–517. https:doi.org/10.1037/0033-295X.115.2.502</w:t>
+        <w:t xml:space="preserve">Moore, D. A., &amp; Healy, P. J. (2008). The trouble with overconfidence. Psychological Review, 115(2), 502–517. https://doi.org/10.1037/0033-295X.115.2.502</w:t>
       </w:r>
     </w:p>
     <w:p>
@@ -2708,7 +2708,7 @@
           <w:szCs w:val="24"/>
           <w:lang w:val="en-US" w:bidi="fa-IR"/>
         </w:rPr>
-        <w:t xml:space="preserve">Ehrlinger, J., Johnson, K., Banner, M., Dunning, D., &amp; Kruger, J. (2008). Why the unskilled are unaware: Further explorations of (absent) self-insight among the incompetent. Organizational Behavior and Human Decision Processes, 105(1), 98–121. https:doi.org/10.1016/j.obhdp.2007.05.002</w:t>
+        <w:t xml:space="preserve">Ehrlinger, J., Johnson, K., Banner, M., Dunning, D., &amp; Kruger, J. (2008). Why the unskilled are unaware: Further explorations of (absent) self-insight among the incompetent. Organizational Behavior and Human Decision Processes, 105(1), 98–121. https://doi.org/10.1016/j.obhdp.2007.05.002</w:t>
       </w:r>
     </w:p>
     <w:p>
@@ -3113,7 +3113,7 @@
           <w:szCs w:val="24"/>
           <w:lang w:val="en-US" w:bidi="fa-IR"/>
         </w:rPr>
-        <w:t xml:space="preserve">Moore, D. A., &amp; Healy, P. J. (2008). The trouble with overconfidence. Psychological Review, 115(2), 502–517. https:doi.org/10.1037/0033-295X.115.2.502</w:t>
+        <w:t xml:space="preserve">Moore, D. A., &amp; Healy, P. J. (2008). The trouble with overconfidence. Psychological Review, 115(2), 502–517. https://doi.org/10.1037/0033-295X.115.2.502</w:t>
       </w:r>
     </w:p>
     <w:p>
@@ -3128,7 +3128,7 @@
           <w:szCs w:val="24"/>
           <w:lang w:val="en-US" w:bidi="fa-IR"/>
         </w:rPr>
-        <w:t xml:space="preserve">Barber, B. M., &amp; Odean, T. (2001). Boys will be boys: Gender, overconfidence, and common stock investment. The Quarterly Journal of Economics, 116(1), 261–292. https:doi.org/10.1162/003355301556400</w:t>
+        <w:t xml:space="preserve">Barber, B. M., &amp; Odean, T. (2001). Boys will be boys: Gender, overconfidence, and common stock investment. The Quarterly Journal of Economics, 116(1), 261–292. https://doi.org/10.1162/003355301556400</w:t>
       </w:r>
     </w:p>
     <w:p>
@@ -3143,7 +3143,7 @@
           <w:szCs w:val="24"/>
           <w:lang w:val="en-US" w:bidi="fa-IR"/>
         </w:rPr>
-        <w:t xml:space="preserve">Grinblatt, M., &amp; Keloharju, M. (2009). Sensation seeking, overconfidence, and trading activity. The Journal of Finance, 64(2), 549–578. https:doi.org/10.1111/j.1540-6261.2009.01443.x</w:t>
+        <w:t xml:space="preserve">Grinblatt, M., &amp; Keloharju, M. (2009). Sensation seeking, overconfidence, and trading activity. The Journal of Finance, 64(2), 549–578. https://doi.org/10.1111/j.1540-6261.2009.01443.x</w:t>
       </w:r>
     </w:p>
     <w:p>
@@ -3158,7 +3158,7 @@
           <w:szCs w:val="24"/>
           <w:lang w:val="en-US" w:bidi="fa-IR"/>
         </w:rPr>
-        <w:t xml:space="preserve">Glaser, M., &amp; Weber, M. (2007). Overconfidence and trading volume. The Geneva Risk and Insurance Review, 32(1), 1–36. https:doi.org/10.1007/s10713-007-0003-3</w:t>
+        <w:t xml:space="preserve">Glaser, M., &amp; Weber, M. (2007). Overconfidence and trading volume. The Geneva Risk and Insurance Review, 32(1), 1–36. https://doi.org/10.1007/s10713-007-0003-3</w:t>
       </w:r>
     </w:p>
     <w:p>
@@ -3563,7 +3563,7 @@
           <w:szCs w:val="24"/>
           <w:lang w:val="en-US" w:bidi="fa-IR"/>
         </w:rPr>
-        <w:t xml:space="preserve">Parasuraman, R., &amp; Manzey, D. H. (2010). Complacency and bias in human use of automation: An attentional integration. Human Factors, 52(3), 381–410. https:doi.org/10.1177/0018720810376055</w:t>
+        <w:t xml:space="preserve">Parasuraman, R., &amp; Manzey, D. H. (2010). Complacency and bias in human use of automation: An attentional integration. Human Factors, 52(3), 381–410. https://doi.org/10.1177/0018720810376055</w:t>
       </w:r>
     </w:p>
     <w:p>
@@ -3578,7 +3578,7 @@
           <w:szCs w:val="24"/>
           <w:lang w:val="en-US" w:bidi="fa-IR"/>
         </w:rPr>
-        <w:t xml:space="preserve">Goddard, K., Roudsari, A., &amp; Wyatt, J. C. (2012). Automation bias: A systematic review of frequency, effect mediators, and mitigators. Journal of the American Medical Informatics Association, 19(1), 121–127. https:doi.org/10.1136/amiajnl-2011-000089</w:t>
+        <w:t xml:space="preserve">Goddard, K., Roudsari, A., &amp; Wyatt, J. C. (2012). Automation bias: A systematic review of frequency, effect mediators, and mitigators. Journal of the American Medical Informatics Association, 19(1), 121–127. https://doi.org/10.1136/amiajnl-2011-000089</w:t>
       </w:r>
     </w:p>
     <w:p>
@@ -3593,7 +3593,7 @@
           <w:szCs w:val="24"/>
           <w:lang w:val="en-US" w:bidi="fa-IR"/>
         </w:rPr>
-        <w:t xml:space="preserve">Skitka, L. J., Mosier, K. L., &amp; Burdick, M. (1999). Does automation bias decision-making? International Journal of Human-Computer Studies, 51(5), 991–1006. https:doi.org/10.1006/ijhc.1999.0252</w:t>
+        <w:t xml:space="preserve">Skitka, L. J., Mosier, K. L., &amp; Burdick, M. (1999). Does automation bias decision-making? International Journal of Human-Computer Studies, 51(5), 991–1006. https://doi.org/10.1006/ijhc.1999.0252</w:t>
       </w:r>
     </w:p>
     <w:p>
@@ -3608,7 +3608,7 @@
           <w:szCs w:val="24"/>
           <w:lang w:val="en-US" w:bidi="fa-IR"/>
         </w:rPr>
-        <w:t xml:space="preserve">Lee, J. D., &amp; See, K. A. (2004). Trust in automation: Designing for appropriate reliance. Human Factors, 46(1), 50–80. https:doi.org/10.1518/hfes.46.1.50_30392</w:t>
+        <w:t xml:space="preserve">Lee, J. D., &amp; See, K. A. (2004). Trust in automation: Designing for appropriate reliance. Human Factors, 46(1), 50–80. https://doi.org/10.1518/hfes.46.1.50_30392</w:t>
       </w:r>
     </w:p>
     <w:p>
@@ -3623,7 +3623,7 @@
           <w:szCs w:val="24"/>
           <w:lang w:val="en-US" w:bidi="fa-IR"/>
         </w:rPr>
-        <w:t xml:space="preserve">Jian, J.-Y., Bisantz, A. M., &amp; Drury, C. G. (2000). Foundations for an empirically determined scale of trust in automated systems. International Journal of Cognitive Ergonomics, 4(1), 53–71. https:doi.org/10.1207/S15327566IJCE0401_04</w:t>
+        <w:t xml:space="preserve">Jian, J.-Y., Bisantz, A. M., &amp; Drury, C. G. (2000). Foundations for an empirically determined scale of trust in automated systems. International Journal of Cognitive Ergonomics, 4(1), 53–71. https://doi.org/10.1207/S15327566IJCE0401_04</w:t>
       </w:r>
     </w:p>
     <w:p>
@@ -3638,7 +3638,7 @@
           <w:szCs w:val="24"/>
           <w:lang w:val="en-US" w:bidi="fa-IR"/>
         </w:rPr>
-        <w:t xml:space="preserve">Dietvorst, B. J., Simmons, J. P., &amp; Massey, C. (2015). Algorithm aversion: People erroneously avoid algorithms after seeing them err. Journal of Experimental Psychology: General, 144(1), 114–126. https:doi.org/10.1037/xge0000033</w:t>
+        <w:t xml:space="preserve">Dietvorst, B. J., Simmons, J. P., &amp; Massey, C. (2015). Algorithm aversion: People erroneously avoid algorithms after seeing them err. Journal of Experimental Psychology: General, 144(1), 114–126. https://doi.org/10.1037/xge0000033</w:t>
       </w:r>
     </w:p>
     <w:p>
@@ -3653,7 +3653,7 @@
           <w:szCs w:val="24"/>
           <w:lang w:val="en-US" w:bidi="fa-IR"/>
         </w:rPr>
-        <w:t xml:space="preserve">Logg, J. M., Minson, J. A., &amp; Moore, D. A. (2019). Algorithm appreciation: People prefer algorithmic to human judgment. Organizational Behavior and Human Decision Processes, 151, 90–103. https:doi.org/10.1016/j.obhdp.2018.12.005</w:t>
+        <w:t xml:space="preserve">Logg, J. M., Minson, J. A., &amp; Moore, D. A. (2019). Algorithm appreciation: People prefer algorithmic to human judgment. Organizational Behavior and Human Decision Processes, 151, 90–103. https://doi.org/10.1016/j.obhdp.2018.12.005</w:t>
       </w:r>
     </w:p>
     <w:p>
@@ -4058,7 +4058,7 @@
           <w:szCs w:val="24"/>
           <w:lang w:val="en-US" w:bidi="fa-IR"/>
         </w:rPr>
-        <w:t xml:space="preserve">Lee, J. D., &amp; See, K. A. (2004). Trust in automation: Designing for appropriate reliance. Human Factors, 46(1), 50–80. https:doi.org/10.1518/hfes.46.1.50_30392</w:t>
+        <w:t xml:space="preserve">Lee, J. D., &amp; See, K. A. (2004). Trust in automation: Designing for appropriate reliance. Human Factors, 46(1), 50–80. https://doi.org/10.1518/hfes.46.1.50_30392</w:t>
       </w:r>
     </w:p>
     <w:p>
@@ -4073,7 +4073,7 @@
           <w:szCs w:val="24"/>
           <w:lang w:val="en-US" w:bidi="fa-IR"/>
         </w:rPr>
-        <w:t xml:space="preserve">Hoff, K. A., &amp; Bashir, M. (2015). Trust in automation: Integrating empirical evidence on factors that influence trust. Human Factors, 57(3), 407–434. https:doi.org/10.1177/0018720814547570</w:t>
+        <w:t xml:space="preserve">Hoff, K. A., &amp; Bashir, M. (2015). Trust in automation: Integrating empirical evidence on factors that influence trust. Human Factors, 57(3), 407–434. https://doi.org/10.1177/0018720814547570</w:t>
       </w:r>
     </w:p>
     <w:p>
@@ -4088,7 +4088,7 @@
           <w:szCs w:val="24"/>
           <w:lang w:val="en-US" w:bidi="fa-IR"/>
         </w:rPr>
-        <w:t xml:space="preserve">Pennycook, G., &amp; Rand, D. G. (2019). Lazy, not biased: Susceptibility to partisan fake news is better explained by lack of reasoning than by motivated reasoning. Cognition, 188, 39–50. https:doi.org/10.1016/j.cognition.2018.06.011</w:t>
+        <w:t xml:space="preserve">Pennycook, G., &amp; Rand, D. G. (2019). Lazy, not biased: Susceptibility to partisan fake news is better explained by lack of reasoning than by motivated reasoning. Cognition, 188, 39–50. https://doi.org/10.1016/j.cognition.2018.06.011</w:t>
       </w:r>
     </w:p>
     <w:p>
@@ -4103,7 +4103,7 @@
           <w:szCs w:val="24"/>
           <w:lang w:val="en-US" w:bidi="fa-IR"/>
         </w:rPr>
-        <w:t xml:space="preserve">Ji, Z., Lee, N., Frieske, R., Yu, T., Su, D., Xu, Y., Ishii, E., Bang, Y. J., Madotto, A., &amp; Fung, P. (2023). Survey of hallucination in natural language generation. ACM Computing Surveys, 55(12), Article 248. https:doi.org/10.1145/3571730</w:t>
+        <w:t xml:space="preserve">Ji, Z., Lee, N., Frieske, R., Yu, T., Su, D., Xu, Y., Ishii, E., Bang, Y. J., Madotto, A., &amp; Fung, P. (2023). Survey of hallucination in natural language generation. ACM Computing Surveys, 55(12), Article 248. https://doi.org/10.1145/3571730</w:t>
       </w:r>
     </w:p>
     <w:p>
@@ -4606,7 +4606,7 @@
           <w:szCs w:val="24"/>
           <w:lang w:val="en-US" w:bidi="fa-IR"/>
         </w:rPr>
-        <w:t xml:space="preserve">Wang, B., Rau, P.-L. P., &amp; Yuan, T. (2023). Measuring user competence in using artificial intelligence: Validity and reliability of artificial intelligence literacy scale. Behaviour &amp; Information Technology, 42(9), 1324–1337. https:doi.org/10.1080/0144929X.2022.2072768</w:t>
+        <w:t xml:space="preserve">Wang, B., Rau, P.-L. P., &amp; Yuan, T. (2023). Measuring user competence in using artificial intelligence: Validity and reliability of artificial intelligence literacy scale. Behaviour &amp; Information Technology, 42(9), 1324–1337. https://doi.org/10.1080/0144929X.2022.2072768</w:t>
       </w:r>
     </w:p>
     <w:p>
@@ -4621,7 +4621,7 @@
           <w:szCs w:val="24"/>
           <w:lang w:val="en-US" w:bidi="fa-IR"/>
         </w:rPr>
-        <w:t xml:space="preserve">Ng, D. T. K., Leung, J. K. L., Chu, S. K. W., &amp; Qiao, M. S. (2021). Conceptualizing AI literacy: An exploratory review. Computers and Education: Artificial Intelligence, 2, 100041. https:doi.org/10.1016/j.caeai.2021.100041</w:t>
+        <w:t xml:space="preserve">Ng, D. T. K., Leung, J. K. L., Chu, S. K. W., &amp; Qiao, M. S. (2021). Conceptualizing AI literacy: An exploratory review. Computers and Education: Artificial Intelligence, 2, 100041. https://doi.org/10.1016/j.caeai.2021.100041</w:t>
       </w:r>
     </w:p>
     <w:p>
@@ -4636,7 +4636,7 @@
           <w:szCs w:val="24"/>
           <w:lang w:val="en-US" w:bidi="fa-IR"/>
         </w:rPr>
-        <w:t xml:space="preserve">Long, D., &amp; Magerko, B. (2020). What is AI literacy? Competencies and design considerations. Proceedings of the 2020 CHI Conference on Human Factors in Computing Systems (pp. 1–16). ACM. https:doi.org/10.1145/3313831.3376727</w:t>
+        <w:t xml:space="preserve">Long, D., &amp; Magerko, B. (2020). What is AI literacy? Competencies and design considerations. Proceedings of the 2020 CHI Conference on Human Factors in Computing Systems (pp. 1–16). ACM. https://doi.org/10.1145/3313831.3376727</w:t>
       </w:r>
     </w:p>
     <w:p>
@@ -5090,7 +5090,7 @@
           <w:szCs w:val="24"/>
           <w:lang w:val="en-US" w:bidi="fa-IR"/>
         </w:rPr>
-        <w:t xml:space="preserve">Parker, A. M., &amp; Fischhoff, B. (2005). Decision-making competence: External validation through an individual-differences approach. Journal of Behavioral Decision Making, 18(1), 1–27. https:doi.org/10.1002/bdm.481</w:t>
+        <w:t xml:space="preserve">Parker, A. M., &amp; Fischhoff, B. (2005). Decision-making competence: External validation through an individual-differences approach. Journal of Behavioral Decision Making, 18(1), 1–27. https://doi.org/10.1002/bdm.481</w:t>
       </w:r>
     </w:p>
     <w:p>
@@ -5105,7 +5105,7 @@
           <w:szCs w:val="24"/>
           <w:lang w:val="en-US" w:bidi="fa-IR"/>
         </w:rPr>
-        <w:t xml:space="preserve">Bruine de Bruin, W., Parker, A. M., &amp; Fischhoff, B. (2007). Individual differences in adult decision-making competence. Journal of Personality and Social Psychology, 92(5), 938–956. https:doi.org/10.1037/0022-3514.92.5.938</w:t>
+        <w:t xml:space="preserve">Bruine de Bruin, W., Parker, A. M., &amp; Fischhoff, B. (2007). Individual differences in adult decision-making competence. Journal of Personality and Social Psychology, 92(5), 938–956. https://doi.org/10.1037/0022-3514.92.5.938</w:t>
       </w:r>
     </w:p>
     <w:p>
@@ -5510,7 +5510,7 @@
           <w:szCs w:val="24"/>
           <w:lang w:val="en-US" w:bidi="fa-IR"/>
         </w:rPr>
-        <w:t xml:space="preserve">Dietvorst, B. J., Simmons, J. P., &amp; Massey, C. (2015). Algorithm aversion: People erroneously avoid algorithms after seeing them err. Journal of Experimental Psychology: General, 144(1), 114–126. https:doi.org/10.1037/xge0000033</w:t>
+        <w:t xml:space="preserve">Dietvorst, B. J., Simmons, J. P., &amp; Massey, C. (2015). Algorithm aversion: People erroneously avoid algorithms after seeing them err. Journal of Experimental Psychology: General, 144(1), 114–126. https://doi.org/10.1037/xge0000033</w:t>
       </w:r>
     </w:p>
     <w:p>
@@ -5525,7 +5525,7 @@
           <w:szCs w:val="24"/>
           <w:lang w:val="en-US" w:bidi="fa-IR"/>
         </w:rPr>
-        <w:t xml:space="preserve">Logg, J. M., Minson, J. A., &amp; Moore, D. A. (2019). Algorithm appreciation: People prefer algorithmic to human judgment. Organizational Behavior and Human Decision Processes, 151, 90–103. https:doi.org/10.1016/j.obhdp.2018.12.005</w:t>
+        <w:t xml:space="preserve">Logg, J. M., Minson, J. A., &amp; Moore, D. A. (2019). Algorithm appreciation: People prefer algorithmic to human judgment. Organizational Behavior and Human Decision Processes, 151, 90–103. https://doi.org/10.1016/j.obhdp.2018.12.005</w:t>
       </w:r>
     </w:p>
     <w:p>
@@ -5540,7 +5540,7 @@
           <w:szCs w:val="24"/>
           <w:lang w:val="en-US" w:bidi="fa-IR"/>
         </w:rPr>
-        <w:t xml:space="preserve">D'Acunto, F., Prabhala, N., &amp; Rossi, A. G. (2019). The promises and pitfalls of robo-advising. The Review of Financial Studies, 32(5), 1983–2020. https:doi.org/10.1093/rfs/hhz014</w:t>
+        <w:t xml:space="preserve">D'Acunto, F., Prabhala, N., &amp; Rossi, A. G. (2019). The promises and pitfalls of robo-advising. The Review of Financial Studies, 32(5), 1983–2020. https://doi.org/10.1093/rfs/hhz014</w:t>
       </w:r>
     </w:p>
     <w:p>

</xml_diff>